<commit_message>
docs: align Lab Session & SRS strictly to Buyer testing scope, removing order pending/fulfillment states
</commit_message>
<xml_diff>
--- a/Dokumen_SRS_GadgetTrustX_Modul2.docx
+++ b/Dokumen_SRS_GadgetTrustX_Modul2.docx
@@ -4800,7 +4800,7 @@
           </w:tcPr>
           <w:p>
             <w:r>
-              <w:t>Sistem memfasilitasi transaksi checkout, pemilihan alamat tujuan, estimasi ongkir ekspedisi, pembuatan invoice token Midtrans, dan verifikasi status pembayaran lunas.</w:t>
+              <w:t>Sistem memfasilitasi transaksi checkout, pemilihan alamat tujuan, estimasi ongkir ekspedisi, dan penerbitan token dialog pembayaran Midtrans Snap untuk pembeli.</w:t>
             </w:r>
           </w:p>
         </w:tc>
@@ -4925,7 +4925,7 @@
               <w:br/>
               <w:t>5. Pembeli memilih metode (QRIS/Transfer VA) pada simulator sandbox dan menyelesaikan pembayaran.</w:t>
               <w:br/>
-              <w:t>6. Webhook Midtrans memperbarui status pesanan menjadi 'Paid' dan invoice sukses dibuat.</w:t>
+              <w:t>6. Dialog pembayaran Midtrans Snap menampilkan konfirmasi transaksi dan detail invoice belanja pembeli.</w:t>
             </w:r>
           </w:p>
         </w:tc>
@@ -4962,7 +4962,7 @@
           </w:tcPr>
           <w:p>
             <w:r>
-              <w:t>• Jika transaksi dibatalkan oleh pengguna, token transaksi kedaluwarsa dan status pesanan menjadi 'Cancelled'.</w:t>
+              <w:t>• Jika dialog pembayaran ditutup oleh pembeli, sistem kembali ke antarmuka checkout secara aman tanpa menghapus produk terpilih.</w:t>
               <w:br/>
               <w:t>• Jika stok habis saat proses checkout berlangsung, sistem membatalkan transaksi secara aman.</w:t>
             </w:r>
@@ -5003,7 +5003,7 @@
           </w:tcPr>
           <w:p>
             <w:r>
-              <w:t>Pesanan tercatat di database dengan status lunas, stok produk berkurang otomatis.</w:t>
+              <w:t>Transaksi pembayaran berhasil diverifikasi dan faktur belanja diterbitkan untuk pembeli.</w:t>
             </w:r>
           </w:p>
         </w:tc>
@@ -7261,7 +7261,7 @@
               <w:br/>
               <w:t>5. Pembeli menekan 'Kirim Pengajuan'.</w:t>
               <w:br/>
-              <w:t>6. Sistem menerbitkan nomor tiket komplain dan mengubah status pesanan menjadi 'Return Pending'.</w:t>
+              <w:t>6. Sistem menerbitkan nomor tiket komplain dan mencatat riwayat pengajuan klaim pembeli.</w:t>
             </w:r>
           </w:p>
         </w:tc>

</xml_diff>